<commit_message>
Embed the complete admin portal in Atlas firmware and retire portal packs
</commit_message>
<xml_diff>
--- a/Documentation/User Manual/TurnHub Manual V0.14.docx
+++ b/Documentation/User Manual/TurnHub Manual V0.14.docx
@@ -1830,7 +1830,7 @@
       </w:r>
       <w:r>
         <w:rPr/>
-        <w:t xml:space="preserve"> asks you to type RESET to confirm. It then erases every profile, PIN, statistic it holds, Sigil pairing, the Wi-Fi password (back to TurnHub-Setup) and all settings, empties the microSD card apart from the web portal kept on it, and restarts as new, asking for touchscreen calibration and then setup (section 3). This cannot be undone.</w:t>
+        <w:t xml:space="preserve"> asks you to type RESET to confirm. It then erases every profile, PIN, statistic it holds, Sigil pairing, the Wi-Fi password (back to TurnHub-Setup) and all settings, empties the microSD card (the admin portal stays in firmware), and restarts as new, asking for touchscreen calibration and then setup (section 3). This cannot be undone.</w:t>
       </w:r>
     </w:p>
     <w:p>
@@ -4441,7 +4441,7 @@
     </w:p>
     <w:p>
       <w:r>
-        <w:t>Signed local Atlas, Sigil and portal package installation remains available. Developer diagnostics and hardware tests require Developer permission, including for an Admin.</w:t>
+        <w:t>Signed local Atlas and Sigil firmware installation remains available. The full admin portal is included in Atlas firmware and works without a microSD card. Developer diagnostics and hardware tests require Developer permission, including for an Admin.</w:t>
       </w:r>
     </w:p>
     <w:p>
@@ -6847,7 +6847,7 @@
         <w:pStyle w:val="NormalWeb"/>
       </w:pPr>
       <w:r>
-        <w:t xml:space="preserve">Use the TurnHub Android app or a Sigil for play. The portal handles administration. Install Atlas firmware 0.7.6 and portal pack 2.0.0 together; earlier installed portal packs use the cardless administration fallback on this firmware.</w:t>
+        <w:t xml:space="preserve">Use the TurnHub Android app or a Sigil for play. The portal handles administration. Atlas firmware 0.7.7 includes the full portal: install one Atlas firmware update and reload existing browser tabs. No separate portal pack or microSD card is needed for administration.</w:t>
       </w:r>
     </w:p>
     <w:p>

</xml_diff>